<commit_message>
docs(collections): enrich landing page copy packs with full collection detail
Replaces the thin one-paragraph blurbs in each collection's Word doc
with the fuller content set (full "about" narrative, total items,
holding institution, physical location, date range, languages,
formats held, visit hours/contact) sourced from the CCS prototype
v0.2 data file, cross-checked against the live page content. Figures
are prototype estimates flagged for verification against the
authoritative collection management system before publication.

Co-Authored-By: Claude Sonnet 5 <noreply@anthropic.com>
Claude-Session: https://claude.ai/code/session_016VZPHDCdpd16hAc5Tub1ZX
</commit_message>
<xml_diff>
--- a/assets/Grainger Museum Collection - Landing Page Copy.docx
+++ b/assets/Grainger Museum Collection - Landing Page Copy.docx
@@ -20,7 +20,201 @@
     </w:p>
     <w:p>
       <w:r>
-        <w:t>The personal archive, instruments and scores of composer Percy Grainger, held in trust for scholarship worldwide.</w:t>
+        <w:t>The personal collection of composer Percy Grainger including instruments, manuscripts, correspondence and experimental machines.</w:t>
+      </w:r>
+    </w:p>
+    <w:p>
+      <w:pPr>
+        <w:pStyle w:val="Heading2"/>
+      </w:pPr>
+      <w:r>
+        <w:t>About this collection</w:t>
+      </w:r>
+    </w:p>
+    <w:p>
+      <w:r>
+        <w:t>Australian musician and composer Percy Grainger established the Grainger Museum in 1938, motivated by the desire to interpret and contextualise his creative achievements and cultural environment. The Grainger Museum Collection, an internationally significant archive of over 100,000 items, spans a range of disciplines, from experimental sound technology and musical instruments to costumes, ethnography, art and design. The collection is brought to life through collaboration with students, academic partners and artists and their creative work and production.</w:t>
+      </w:r>
+    </w:p>
+    <w:p>
+      <w:pPr>
+        <w:pStyle w:val="Heading2"/>
+      </w:pPr>
+      <w:r>
+        <w:t>Collection details</w:t>
+      </w:r>
+    </w:p>
+    <w:tbl>
+      <w:tblPr>
+        <w:tblStyle w:val="LightGrid-Accent1"/>
+        <w:tblW w:type="auto" w:w="0"/>
+        <w:tblLook w:firstColumn="1" w:firstRow="1" w:lastColumn="0" w:lastRow="0" w:noHBand="0" w:noVBand="1" w:val="04A0"/>
+      </w:tblPr>
+      <w:tblGrid>
+        <w:gridCol w:w="4320"/>
+        <w:gridCol w:w="4320"/>
+      </w:tblGrid>
+      <w:tr>
+        <w:tc>
+          <w:tcPr>
+            <w:tcW w:type="dxa" w:w="4320"/>
+          </w:tcPr>
+          <w:p>
+            <w:r>
+              <w:t>Total items</w:t>
+            </w:r>
+          </w:p>
+        </w:tc>
+        <w:tc>
+          <w:tcPr>
+            <w:tcW w:type="dxa" w:w="4320"/>
+          </w:tcPr>
+          <w:p>
+            <w:r>
+              <w:t>7,800</w:t>
+            </w:r>
+          </w:p>
+        </w:tc>
+      </w:tr>
+      <w:tr>
+        <w:tc>
+          <w:tcPr>
+            <w:tcW w:type="dxa" w:w="4320"/>
+          </w:tcPr>
+          <w:p>
+            <w:r>
+              <w:t>Holding institution</w:t>
+            </w:r>
+          </w:p>
+        </w:tc>
+        <w:tc>
+          <w:tcPr>
+            <w:tcW w:type="dxa" w:w="4320"/>
+          </w:tcPr>
+          <w:p>
+            <w:r>
+              <w:t>Grainger Museum</w:t>
+            </w:r>
+          </w:p>
+        </w:tc>
+      </w:tr>
+      <w:tr>
+        <w:tc>
+          <w:tcPr>
+            <w:tcW w:type="dxa" w:w="4320"/>
+          </w:tcPr>
+          <w:p>
+            <w:r>
+              <w:t>Physical location</w:t>
+            </w:r>
+          </w:p>
+        </w:tc>
+        <w:tc>
+          <w:tcPr>
+            <w:tcW w:type="dxa" w:w="4320"/>
+          </w:tcPr>
+          <w:p>
+            <w:r>
+              <w:t>Parkville VIC 3010</w:t>
+            </w:r>
+          </w:p>
+        </w:tc>
+      </w:tr>
+      <w:tr>
+        <w:tc>
+          <w:tcPr>
+            <w:tcW w:type="dxa" w:w="4320"/>
+          </w:tcPr>
+          <w:p>
+            <w:r>
+              <w:t>Date range</w:t>
+            </w:r>
+          </w:p>
+        </w:tc>
+        <w:tc>
+          <w:tcPr>
+            <w:tcW w:type="dxa" w:w="4320"/>
+          </w:tcPr>
+          <w:p>
+            <w:r>
+              <w:t>1890 – present</w:t>
+            </w:r>
+          </w:p>
+        </w:tc>
+      </w:tr>
+      <w:tr>
+        <w:tc>
+          <w:tcPr>
+            <w:tcW w:type="dxa" w:w="4320"/>
+          </w:tcPr>
+          <w:p>
+            <w:r>
+              <w:t>Languages</w:t>
+            </w:r>
+          </w:p>
+        </w:tc>
+        <w:tc>
+          <w:tcPr>
+            <w:tcW w:type="dxa" w:w="4320"/>
+          </w:tcPr>
+          <w:p>
+            <w:r>
+              <w:t>English</w:t>
+            </w:r>
+          </w:p>
+        </w:tc>
+      </w:tr>
+      <w:tr>
+        <w:tc>
+          <w:tcPr>
+            <w:tcW w:type="dxa" w:w="4320"/>
+          </w:tcPr>
+          <w:p>
+            <w:r>
+              <w:t>Formats held</w:t>
+            </w:r>
+          </w:p>
+        </w:tc>
+        <w:tc>
+          <w:tcPr>
+            <w:tcW w:type="dxa" w:w="4320"/>
+          </w:tcPr>
+          <w:p>
+            <w:r>
+              <w:t>Instruments, Manuscripts, Correspondence</w:t>
+            </w:r>
+          </w:p>
+        </w:tc>
+      </w:tr>
+    </w:tbl>
+    <w:p>
+      <w:pPr>
+        <w:pStyle w:val="Heading2"/>
+      </w:pPr>
+      <w:r>
+        <w:t>Visit details</w:t>
+      </w:r>
+    </w:p>
+    <w:p>
+      <w:r>
+        <w:rPr>
+          <w:b/>
+        </w:rPr>
+        <w:t xml:space="preserve">Opening hours: </w:t>
+      </w:r>
+      <w:r>
+        <w:t>Tue–Sun 12:00pm – 5:00pm</w:t>
+      </w:r>
+    </w:p>
+    <w:p>
+      <w:r>
+        <w:rPr>
+          <w:b/>
+        </w:rPr>
+        <w:t xml:space="preserve">Enquiries: </w:t>
+      </w:r>
+      <w:r>
+        <w:t>grainger.museum@unimelb.edu.au  |  +61 3 8344 8828</w:t>
       </w:r>
     </w:p>
     <w:p>
@@ -46,7 +240,7 @@
     </w:p>
     <w:p>
       <w:r>
-        <w:t>Extracted from the live CCS collection landing page template (public/collections/*.html) on 2026-10-01, as the canonical content source referenced by Jira CCS-189 ("Create collection landing page content").</w:t>
+        <w:t>Content sourced from the CCS prototype v0.2 data file (CCS-prototype-2026-v0.2-main/data.js), cross-checked against the live CCS collection landing page template, as the canonical content source referenced by Jira CCS-189 ("Create collection landing page content"). Figures (total items, dates) are prototype placeholder estimates and should be verified against the authoritative collection management system before publication.</w:t>
       </w:r>
     </w:p>
     <w:sectPr>

</xml_diff>

<commit_message>
docs(collections): enrich landing page copy packs with full collection detail (#31)
Replaces the thin one-paragraph blurbs in each collection's Word doc
with the fuller content set (full "about" narrative, total items,
holding institution, physical location, date range, languages,
formats held, visit hours/contact) sourced from the CCS prototype
v0.2 data file, cross-checked against the live page content. Figures
are prototype estimates flagged for verification against the
authoritative collection management system before publication.


Claude-Session: https://claude.ai/code/session_016VZPHDCdpd16hAc5Tub1ZX

Co-authored-by: Claude Sonnet 5 <noreply@anthropic.com>
</commit_message>
<xml_diff>
--- a/assets/Grainger Museum Collection - Landing Page Copy.docx
+++ b/assets/Grainger Museum Collection - Landing Page Copy.docx
@@ -20,7 +20,201 @@
     </w:p>
     <w:p>
       <w:r>
-        <w:t>The personal archive, instruments and scores of composer Percy Grainger, held in trust for scholarship worldwide.</w:t>
+        <w:t>The personal collection of composer Percy Grainger including instruments, manuscripts, correspondence and experimental machines.</w:t>
+      </w:r>
+    </w:p>
+    <w:p>
+      <w:pPr>
+        <w:pStyle w:val="Heading2"/>
+      </w:pPr>
+      <w:r>
+        <w:t>About this collection</w:t>
+      </w:r>
+    </w:p>
+    <w:p>
+      <w:r>
+        <w:t>Australian musician and composer Percy Grainger established the Grainger Museum in 1938, motivated by the desire to interpret and contextualise his creative achievements and cultural environment. The Grainger Museum Collection, an internationally significant archive of over 100,000 items, spans a range of disciplines, from experimental sound technology and musical instruments to costumes, ethnography, art and design. The collection is brought to life through collaboration with students, academic partners and artists and their creative work and production.</w:t>
+      </w:r>
+    </w:p>
+    <w:p>
+      <w:pPr>
+        <w:pStyle w:val="Heading2"/>
+      </w:pPr>
+      <w:r>
+        <w:t>Collection details</w:t>
+      </w:r>
+    </w:p>
+    <w:tbl>
+      <w:tblPr>
+        <w:tblStyle w:val="LightGrid-Accent1"/>
+        <w:tblW w:type="auto" w:w="0"/>
+        <w:tblLook w:firstColumn="1" w:firstRow="1" w:lastColumn="0" w:lastRow="0" w:noHBand="0" w:noVBand="1" w:val="04A0"/>
+      </w:tblPr>
+      <w:tblGrid>
+        <w:gridCol w:w="4320"/>
+        <w:gridCol w:w="4320"/>
+      </w:tblGrid>
+      <w:tr>
+        <w:tc>
+          <w:tcPr>
+            <w:tcW w:type="dxa" w:w="4320"/>
+          </w:tcPr>
+          <w:p>
+            <w:r>
+              <w:t>Total items</w:t>
+            </w:r>
+          </w:p>
+        </w:tc>
+        <w:tc>
+          <w:tcPr>
+            <w:tcW w:type="dxa" w:w="4320"/>
+          </w:tcPr>
+          <w:p>
+            <w:r>
+              <w:t>7,800</w:t>
+            </w:r>
+          </w:p>
+        </w:tc>
+      </w:tr>
+      <w:tr>
+        <w:tc>
+          <w:tcPr>
+            <w:tcW w:type="dxa" w:w="4320"/>
+          </w:tcPr>
+          <w:p>
+            <w:r>
+              <w:t>Holding institution</w:t>
+            </w:r>
+          </w:p>
+        </w:tc>
+        <w:tc>
+          <w:tcPr>
+            <w:tcW w:type="dxa" w:w="4320"/>
+          </w:tcPr>
+          <w:p>
+            <w:r>
+              <w:t>Grainger Museum</w:t>
+            </w:r>
+          </w:p>
+        </w:tc>
+      </w:tr>
+      <w:tr>
+        <w:tc>
+          <w:tcPr>
+            <w:tcW w:type="dxa" w:w="4320"/>
+          </w:tcPr>
+          <w:p>
+            <w:r>
+              <w:t>Physical location</w:t>
+            </w:r>
+          </w:p>
+        </w:tc>
+        <w:tc>
+          <w:tcPr>
+            <w:tcW w:type="dxa" w:w="4320"/>
+          </w:tcPr>
+          <w:p>
+            <w:r>
+              <w:t>Parkville VIC 3010</w:t>
+            </w:r>
+          </w:p>
+        </w:tc>
+      </w:tr>
+      <w:tr>
+        <w:tc>
+          <w:tcPr>
+            <w:tcW w:type="dxa" w:w="4320"/>
+          </w:tcPr>
+          <w:p>
+            <w:r>
+              <w:t>Date range</w:t>
+            </w:r>
+          </w:p>
+        </w:tc>
+        <w:tc>
+          <w:tcPr>
+            <w:tcW w:type="dxa" w:w="4320"/>
+          </w:tcPr>
+          <w:p>
+            <w:r>
+              <w:t>1890 – present</w:t>
+            </w:r>
+          </w:p>
+        </w:tc>
+      </w:tr>
+      <w:tr>
+        <w:tc>
+          <w:tcPr>
+            <w:tcW w:type="dxa" w:w="4320"/>
+          </w:tcPr>
+          <w:p>
+            <w:r>
+              <w:t>Languages</w:t>
+            </w:r>
+          </w:p>
+        </w:tc>
+        <w:tc>
+          <w:tcPr>
+            <w:tcW w:type="dxa" w:w="4320"/>
+          </w:tcPr>
+          <w:p>
+            <w:r>
+              <w:t>English</w:t>
+            </w:r>
+          </w:p>
+        </w:tc>
+      </w:tr>
+      <w:tr>
+        <w:tc>
+          <w:tcPr>
+            <w:tcW w:type="dxa" w:w="4320"/>
+          </w:tcPr>
+          <w:p>
+            <w:r>
+              <w:t>Formats held</w:t>
+            </w:r>
+          </w:p>
+        </w:tc>
+        <w:tc>
+          <w:tcPr>
+            <w:tcW w:type="dxa" w:w="4320"/>
+          </w:tcPr>
+          <w:p>
+            <w:r>
+              <w:t>Instruments, Manuscripts, Correspondence</w:t>
+            </w:r>
+          </w:p>
+        </w:tc>
+      </w:tr>
+    </w:tbl>
+    <w:p>
+      <w:pPr>
+        <w:pStyle w:val="Heading2"/>
+      </w:pPr>
+      <w:r>
+        <w:t>Visit details</w:t>
+      </w:r>
+    </w:p>
+    <w:p>
+      <w:r>
+        <w:rPr>
+          <w:b/>
+        </w:rPr>
+        <w:t xml:space="preserve">Opening hours: </w:t>
+      </w:r>
+      <w:r>
+        <w:t>Tue–Sun 12:00pm – 5:00pm</w:t>
+      </w:r>
+    </w:p>
+    <w:p>
+      <w:r>
+        <w:rPr>
+          <w:b/>
+        </w:rPr>
+        <w:t xml:space="preserve">Enquiries: </w:t>
+      </w:r>
+      <w:r>
+        <w:t>grainger.museum@unimelb.edu.au  |  +61 3 8344 8828</w:t>
       </w:r>
     </w:p>
     <w:p>
@@ -46,7 +240,7 @@
     </w:p>
     <w:p>
       <w:r>
-        <w:t>Extracted from the live CCS collection landing page template (public/collections/*.html) on 2026-10-01, as the canonical content source referenced by Jira CCS-189 ("Create collection landing page content").</w:t>
+        <w:t>Content sourced from the CCS prototype v0.2 data file (CCS-prototype-2026-v0.2-main/data.js), cross-checked against the live CCS collection landing page template, as the canonical content source referenced by Jira CCS-189 ("Create collection landing page content"). Figures (total items, dates) are prototype placeholder estimates and should be verified against the authoritative collection management system before publication.</w:t>
       </w:r>
     </w:p>
     <w:sectPr>

</xml_diff>